<commit_message>
Agregación épicas documento :3
</commit_message>
<xml_diff>
--- a/docs/SORA v1 HU.docx
+++ b/docs/SORA v1 HU.docx
@@ -70,943 +70,943 @@
     <w:p>
       <w:r>
         <w:pict w14:anchorId="5B5AC0A9">
+          <v:rect id="_x0000_i1025" style="width:0;height:1.5pt" o:hralign="center" o:hrstd="t" o:hr="t" fillcolor="#a0a0a0" stroked="f"/>
+        </w:pict>
+      </w:r>
+    </w:p>
+    <w:p>
+      <w:pPr>
+        <w:rPr>
+          <w:b/>
+          <w:bCs/>
+        </w:rPr>
+      </w:pPr>
+      <w:r>
+        <w:rPr>
+          <w:b/>
+          <w:bCs/>
+        </w:rPr>
+        <w:t>HU-002</w:t>
+      </w:r>
+    </w:p>
+    <w:p>
+      <w:r>
+        <w:rPr>
+          <w:b/>
+          <w:bCs/>
+        </w:rPr>
+        <w:t>Como estudiante</w:t>
+      </w:r>
+    </w:p>
+    <w:p>
+      <w:r>
+        <w:t>Quiero cerrar sesión</w:t>
+      </w:r>
+    </w:p>
+    <w:p>
+      <w:r>
+        <w:rPr>
+          <w:b/>
+          <w:bCs/>
+        </w:rPr>
+        <w:t>Para</w:t>
+      </w:r>
+      <w:r>
+        <w:t xml:space="preserve"> proteger mi información.</w:t>
+      </w:r>
+    </w:p>
+    <w:p>
+      <w:r>
+        <w:pict w14:anchorId="439E0D14">
+          <v:rect id="_x0000_i1026" style="width:0;height:1.5pt" o:hralign="center" o:hrstd="t" o:hr="t" fillcolor="#a0a0a0" stroked="f"/>
+        </w:pict>
+      </w:r>
+    </w:p>
+    <w:p>
+      <w:pPr>
+        <w:rPr>
+          <w:b/>
+          <w:bCs/>
+        </w:rPr>
+      </w:pPr>
+      <w:r>
+        <w:rPr>
+          <w:b/>
+          <w:bCs/>
+        </w:rPr>
+        <w:t>HU-003</w:t>
+      </w:r>
+    </w:p>
+    <w:p>
+      <w:r>
+        <w:rPr>
+          <w:b/>
+          <w:bCs/>
+        </w:rPr>
+        <w:t>Como estudiante</w:t>
+      </w:r>
+    </w:p>
+    <w:p>
+      <w:r>
+        <w:t>Quiero recuperar mi contraseña</w:t>
+      </w:r>
+    </w:p>
+    <w:p>
+      <w:r>
+        <w:t>Para</w:t>
+      </w:r>
+      <w:r>
+        <w:t xml:space="preserve"> volver a acceder a mi cuenta si la olvido.</w:t>
+      </w:r>
+    </w:p>
+    <w:p>
+      <w:pPr>
+        <w:rPr>
+          <w:b/>
+          <w:bCs/>
+        </w:rPr>
+      </w:pPr>
+    </w:p>
+    <w:p>
+      <w:pPr>
+        <w:rPr>
+          <w:b/>
+          <w:bCs/>
+        </w:rPr>
+      </w:pPr>
+      <w:r>
+        <w:rPr>
+          <w:b/>
+          <w:bCs/>
+        </w:rPr>
+        <w:t>MÓDULO 2: DASHBOARD</w:t>
+      </w:r>
+    </w:p>
+    <w:p>
+      <w:pPr>
+        <w:rPr>
+          <w:b/>
+          <w:bCs/>
+        </w:rPr>
+      </w:pPr>
+    </w:p>
+    <w:p>
+      <w:pPr>
+        <w:rPr>
+          <w:b/>
+          <w:bCs/>
+        </w:rPr>
+      </w:pPr>
+      <w:r>
+        <w:rPr>
+          <w:b/>
+          <w:bCs/>
+        </w:rPr>
+        <w:t>HU-004</w:t>
+      </w:r>
+    </w:p>
+    <w:p>
+      <w:r>
+        <w:rPr>
+          <w:b/>
+          <w:bCs/>
+        </w:rPr>
+        <w:t>Como estudiante</w:t>
+      </w:r>
+    </w:p>
+    <w:p>
+      <w:r>
+        <w:t>Quiero visualizar mi último puntaje obtenido</w:t>
+      </w:r>
+    </w:p>
+    <w:p>
+      <w:r>
+        <w:rPr>
+          <w:b/>
+          <w:bCs/>
+        </w:rPr>
+        <w:t>Para</w:t>
+      </w:r>
+      <w:r>
+        <w:t xml:space="preserve"> conocer mi desempeño más reciente.</w:t>
+      </w:r>
+    </w:p>
+    <w:p>
+      <w:r>
+        <w:pict w14:anchorId="05FC8026">
+          <v:rect id="_x0000_i1027" style="width:0;height:1.5pt" o:hralign="center" o:hrstd="t" o:hr="t" fillcolor="#a0a0a0" stroked="f"/>
+        </w:pict>
+      </w:r>
+    </w:p>
+    <w:p>
+      <w:pPr>
+        <w:rPr>
+          <w:b/>
+          <w:bCs/>
+        </w:rPr>
+      </w:pPr>
+      <w:r>
+        <w:rPr>
+          <w:b/>
+          <w:bCs/>
+        </w:rPr>
+        <w:t>HU-005</w:t>
+      </w:r>
+    </w:p>
+    <w:p>
+      <w:r>
+        <w:rPr>
+          <w:b/>
+          <w:bCs/>
+        </w:rPr>
+        <w:lastRenderedPageBreak/>
+        <w:t>Como estudiante</w:t>
+      </w:r>
+    </w:p>
+    <w:p>
+      <w:r>
+        <w:t>Quiero visualizar mi mejor puntaje histórico</w:t>
+      </w:r>
+    </w:p>
+    <w:p>
+      <w:r>
+        <w:rPr>
+          <w:b/>
+          <w:bCs/>
+        </w:rPr>
+        <w:t>Para</w:t>
+      </w:r>
+      <w:r>
+        <w:t xml:space="preserve"> medir mi progreso.</w:t>
+      </w:r>
+    </w:p>
+    <w:p>
+      <w:r>
+        <w:pict w14:anchorId="42CCF6F7">
+          <v:rect id="_x0000_i1028" style="width:0;height:1.5pt" o:hralign="center" o:hrstd="t" o:hr="t" fillcolor="#a0a0a0" stroked="f"/>
+        </w:pict>
+      </w:r>
+    </w:p>
+    <w:p>
+      <w:pPr>
+        <w:rPr>
+          <w:b/>
+          <w:bCs/>
+        </w:rPr>
+      </w:pPr>
+      <w:r>
+        <w:rPr>
+          <w:b/>
+          <w:bCs/>
+        </w:rPr>
+        <w:t>HU-006</w:t>
+      </w:r>
+    </w:p>
+    <w:p>
+      <w:r>
+        <w:rPr>
+          <w:b/>
+          <w:bCs/>
+        </w:rPr>
+        <w:t>Como estudiante</w:t>
+      </w:r>
+    </w:p>
+    <w:p>
+      <w:r>
+        <w:t>Quiero conocer cuántos simulacros he realizado</w:t>
+      </w:r>
+    </w:p>
+    <w:p>
+      <w:r>
+        <w:rPr>
+          <w:b/>
+          <w:bCs/>
+        </w:rPr>
+        <w:t>Para</w:t>
+      </w:r>
+      <w:r>
+        <w:t xml:space="preserve"> hacer seguimiento a mi preparación.</w:t>
+      </w:r>
+    </w:p>
+    <w:p>
+      <w:r>
+        <w:pict w14:anchorId="4C2B2E4F">
+          <v:rect id="_x0000_i1029" style="width:0;height:1.5pt" o:hralign="center" o:hrstd="t" o:hr="t" fillcolor="#a0a0a0" stroked="f"/>
+        </w:pict>
+      </w:r>
+    </w:p>
+    <w:p>
+      <w:pPr>
+        <w:rPr>
+          <w:b/>
+          <w:bCs/>
+        </w:rPr>
+      </w:pPr>
+      <w:r>
+        <w:rPr>
+          <w:b/>
+          <w:bCs/>
+        </w:rPr>
+        <w:t>HU-007</w:t>
+      </w:r>
+    </w:p>
+    <w:p>
+      <w:r>
+        <w:rPr>
+          <w:b/>
+          <w:bCs/>
+        </w:rPr>
+        <w:t>Como estudiante</w:t>
+      </w:r>
+    </w:p>
+    <w:p>
+      <w:r>
+        <w:t>Quiero acceder rápidamente a simulacros, talleres y estadísticas</w:t>
+      </w:r>
+    </w:p>
+    <w:p>
+      <w:r>
+        <w:rPr>
+          <w:b/>
+          <w:bCs/>
+        </w:rPr>
+        <w:t>Para</w:t>
+      </w:r>
+      <w:r>
+        <w:t xml:space="preserve"> navegar fácilmente por la plataforma.</w:t>
+      </w:r>
+    </w:p>
+    <w:p>
+      <w:pPr>
+        <w:rPr>
+          <w:b/>
+          <w:bCs/>
+        </w:rPr>
+      </w:pPr>
+    </w:p>
+    <w:p>
+      <w:pPr>
+        <w:rPr>
+          <w:b/>
+          <w:bCs/>
+        </w:rPr>
+      </w:pPr>
+      <w:r>
+        <w:rPr>
+          <w:b/>
+          <w:bCs/>
+        </w:rPr>
+        <w:t>MÓDULO 3: SIMULACROS</w:t>
+      </w:r>
+    </w:p>
+    <w:p/>
+    <w:p>
+      <w:pPr>
+        <w:rPr>
+          <w:b/>
+          <w:bCs/>
+        </w:rPr>
+      </w:pPr>
+      <w:r>
+        <w:rPr>
+          <w:b/>
+          <w:bCs/>
+        </w:rPr>
+        <w:t>HU-008</w:t>
+      </w:r>
+    </w:p>
+    <w:p>
+      <w:r>
+        <w:rPr>
+          <w:b/>
+          <w:bCs/>
+        </w:rPr>
+        <w:t>Como estudiante</w:t>
+      </w:r>
+    </w:p>
+    <w:p>
+      <w:r>
+        <w:t>Quiero generar un simulacro completo</w:t>
+      </w:r>
+    </w:p>
+    <w:p>
+      <w:r>
+        <w:rPr>
+          <w:b/>
+          <w:bCs/>
+        </w:rPr>
+        <w:t>Para</w:t>
+      </w:r>
+      <w:r>
+        <w:t xml:space="preserve"> practicar en condiciones similares al ICFES.</w:t>
+      </w:r>
+    </w:p>
+    <w:p>
+      <w:r>
+        <w:pict w14:anchorId="7CE4887C">
+          <v:rect id="_x0000_i1030" style="width:0;height:1.5pt" o:hralign="center" o:hrstd="t" o:hr="t" fillcolor="#a0a0a0" stroked="f"/>
+        </w:pict>
+      </w:r>
+    </w:p>
+    <w:p>
+      <w:pPr>
+        <w:rPr>
+          <w:b/>
+          <w:bCs/>
+        </w:rPr>
+      </w:pPr>
+      <w:r>
+        <w:rPr>
+          <w:b/>
+          <w:bCs/>
+        </w:rPr>
+        <w:t>HU-009</w:t>
+      </w:r>
+    </w:p>
+    <w:p>
+      <w:r>
+        <w:rPr>
+          <w:b/>
+          <w:bCs/>
+        </w:rPr>
+        <w:t>Como estudiante</w:t>
+      </w:r>
+    </w:p>
+    <w:p>
+      <w:r>
+        <w:t>Quiero generar un simulacro por área</w:t>
+      </w:r>
+    </w:p>
+    <w:p>
+      <w:r>
+        <w:rPr>
+          <w:b/>
+          <w:bCs/>
+        </w:rPr>
+        <w:t>Para</w:t>
+      </w:r>
+      <w:r>
+        <w:t xml:space="preserve"> reforzar una materia específica.</w:t>
+      </w:r>
+    </w:p>
+    <w:p>
+      <w:r>
+        <w:pict w14:anchorId="6654FDD9">
+          <v:rect id="_x0000_i1031" style="width:0;height:1.5pt" o:hralign="center" o:hrstd="t" o:hr="t" fillcolor="#a0a0a0" stroked="f"/>
+        </w:pict>
+      </w:r>
+    </w:p>
+    <w:p>
+      <w:pPr>
+        <w:rPr>
+          <w:b/>
+          <w:bCs/>
+        </w:rPr>
+      </w:pPr>
+      <w:r>
+        <w:rPr>
+          <w:b/>
+          <w:bCs/>
+        </w:rPr>
+        <w:lastRenderedPageBreak/>
+        <w:t>HU-010</w:t>
+      </w:r>
+    </w:p>
+    <w:p>
+      <w:r>
+        <w:rPr>
+          <w:b/>
+          <w:bCs/>
+        </w:rPr>
+        <w:t>Como estudiante</w:t>
+      </w:r>
+    </w:p>
+    <w:p>
+      <w:r>
+        <w:t>Quiero elegir si realizar un simulacro cronometrado o libre</w:t>
+      </w:r>
+    </w:p>
+    <w:p>
+      <w:r>
+        <w:rPr>
+          <w:b/>
+          <w:bCs/>
+        </w:rPr>
+        <w:t>Para</w:t>
+      </w:r>
+      <w:r>
+        <w:t xml:space="preserve"> adaptar la práctica a mis necesidades.</w:t>
+      </w:r>
+    </w:p>
+    <w:p>
+      <w:r>
+        <w:pict w14:anchorId="659B50F6">
+          <v:rect id="_x0000_i1032" style="width:0;height:1.5pt" o:hralign="center" o:hrstd="t" o:hr="t" fillcolor="#a0a0a0" stroked="f"/>
+        </w:pict>
+      </w:r>
+    </w:p>
+    <w:p>
+      <w:pPr>
+        <w:rPr>
+          <w:b/>
+          <w:bCs/>
+        </w:rPr>
+      </w:pPr>
+      <w:r>
+        <w:rPr>
+          <w:b/>
+          <w:bCs/>
+        </w:rPr>
+        <w:t>HU-011</w:t>
+      </w:r>
+    </w:p>
+    <w:p>
+      <w:r>
+        <w:rPr>
+          <w:b/>
+          <w:bCs/>
+        </w:rPr>
+        <w:t>Como estudiante</w:t>
+      </w:r>
+    </w:p>
+    <w:p>
+      <w:r>
+        <w:t>Quiero responder preguntas con texto, imágenes y contextos</w:t>
+      </w:r>
+    </w:p>
+    <w:p>
+      <w:r>
+        <w:rPr>
+          <w:b/>
+          <w:bCs/>
+        </w:rPr>
+        <w:t>Para</w:t>
+      </w:r>
+      <w:r>
+        <w:t xml:space="preserve"> resolver ejercicios similares a los del ICFES.</w:t>
+      </w:r>
+    </w:p>
+    <w:p>
+      <w:r>
+        <w:pict w14:anchorId="127DD31F">
+          <v:rect id="_x0000_i1033" style="width:0;height:1.5pt" o:hralign="center" o:hrstd="t" o:hr="t" fillcolor="#a0a0a0" stroked="f"/>
+        </w:pict>
+      </w:r>
+    </w:p>
+    <w:p>
+      <w:pPr>
+        <w:rPr>
+          <w:b/>
+          <w:bCs/>
+        </w:rPr>
+      </w:pPr>
+      <w:r>
+        <w:rPr>
+          <w:b/>
+          <w:bCs/>
+        </w:rPr>
+        <w:t>HU-012</w:t>
+      </w:r>
+    </w:p>
+    <w:p>
+      <w:r>
+        <w:rPr>
+          <w:b/>
+          <w:bCs/>
+        </w:rPr>
+        <w:t>Como estudiante</w:t>
+      </w:r>
+    </w:p>
+    <w:p>
+      <w:r>
+        <w:t>Quiero guardar automáticamente mi progreso</w:t>
+      </w:r>
+    </w:p>
+    <w:p>
+      <w:r>
+        <w:rPr>
+          <w:b/>
+          <w:bCs/>
+        </w:rPr>
+        <w:t>Para</w:t>
+      </w:r>
+      <w:r>
+        <w:t xml:space="preserve"> continuar posteriormente si debo salir.</w:t>
+      </w:r>
+    </w:p>
+    <w:p>
+      <w:r>
+        <w:pict w14:anchorId="0019195E">
+          <v:rect id="_x0000_i1034" style="width:0;height:1.5pt" o:hralign="center" o:hrstd="t" o:hr="t" fillcolor="#a0a0a0" stroked="f"/>
+        </w:pict>
+      </w:r>
+    </w:p>
+    <w:p>
+      <w:pPr>
+        <w:rPr>
+          <w:b/>
+          <w:bCs/>
+        </w:rPr>
+      </w:pPr>
+      <w:r>
+        <w:rPr>
+          <w:b/>
+          <w:bCs/>
+        </w:rPr>
+        <w:t>HU-013</w:t>
+      </w:r>
+    </w:p>
+    <w:p>
+      <w:r>
+        <w:rPr>
+          <w:b/>
+          <w:bCs/>
+        </w:rPr>
+        <w:t>Como estudiante</w:t>
+      </w:r>
+    </w:p>
+    <w:p>
+      <w:r>
+        <w:t>Quiero finalizar un simulacro</w:t>
+      </w:r>
+    </w:p>
+    <w:p>
+      <w:r>
+        <w:rPr>
+          <w:b/>
+          <w:bCs/>
+        </w:rPr>
+        <w:t>Para</w:t>
+      </w:r>
+      <w:r>
+        <w:t xml:space="preserve"> obtener mis resultados.</w:t>
+      </w:r>
+    </w:p>
+    <w:p/>
+    <w:p>
+      <w:pPr>
+        <w:rPr>
+          <w:b/>
+          <w:bCs/>
+        </w:rPr>
+      </w:pPr>
+      <w:r>
+        <w:rPr>
+          <w:b/>
+          <w:bCs/>
+        </w:rPr>
+        <w:t>MÓDULO 4: TALLERES</w:t>
+      </w:r>
+    </w:p>
+    <w:p>
+      <w:pPr>
+        <w:rPr>
+          <w:b/>
+          <w:bCs/>
+        </w:rPr>
+      </w:pPr>
+    </w:p>
+    <w:p>
+      <w:pPr>
+        <w:rPr>
+          <w:b/>
+          <w:bCs/>
+        </w:rPr>
+      </w:pPr>
+      <w:r>
+        <w:rPr>
+          <w:b/>
+          <w:bCs/>
+        </w:rPr>
+        <w:t>HU-014</w:t>
+      </w:r>
+    </w:p>
+    <w:p>
+      <w:pPr>
+        <w:rPr>
+          <w:b/>
+          <w:bCs/>
+        </w:rPr>
+      </w:pPr>
+      <w:r>
+        <w:rPr>
+          <w:b/>
+          <w:bCs/>
+        </w:rPr>
+        <w:t>Como estudiante</w:t>
+      </w:r>
+    </w:p>
+    <w:p>
+      <w:pPr>
+        <w:rPr>
+          <w:b/>
+          <w:bCs/>
+        </w:rPr>
+      </w:pPr>
+      <w:r>
+        <w:rPr>
+          <w:b/>
+          <w:bCs/>
+        </w:rPr>
+        <w:t>Quiero acceder a talleres por área</w:t>
+      </w:r>
+    </w:p>
+    <w:p>
+      <w:pPr>
+        <w:rPr>
+          <w:b/>
+          <w:bCs/>
+        </w:rPr>
+      </w:pPr>
+      <w:r>
+        <w:rPr>
+          <w:b/>
+          <w:bCs/>
+        </w:rPr>
+        <w:t>Para practicar temas específicos.</w:t>
+      </w:r>
+    </w:p>
+    <w:p>
+      <w:pPr>
+        <w:rPr>
+          <w:b/>
+          <w:bCs/>
+        </w:rPr>
+      </w:pPr>
+      <w:r>
+        <w:rPr>
+          <w:b/>
+          <w:bCs/>
+        </w:rPr>
+        <w:lastRenderedPageBreak/>
+        <w:pict w14:anchorId="724F50D8">
+          <v:rect id="_x0000_i1035" style="width:0;height:1.5pt" o:hralign="center" o:hrstd="t" o:hr="t" fillcolor="#a0a0a0" stroked="f"/>
+        </w:pict>
+      </w:r>
+    </w:p>
+    <w:p>
+      <w:pPr>
+        <w:rPr>
+          <w:b/>
+          <w:bCs/>
+        </w:rPr>
+      </w:pPr>
+      <w:r>
+        <w:rPr>
+          <w:b/>
+          <w:bCs/>
+        </w:rPr>
+        <w:t>HU-015</w:t>
+      </w:r>
+    </w:p>
+    <w:p>
+      <w:pPr>
+        <w:rPr>
+          <w:b/>
+          <w:bCs/>
+        </w:rPr>
+      </w:pPr>
+      <w:r>
+        <w:rPr>
+          <w:b/>
+          <w:bCs/>
+        </w:rPr>
+        <w:t>Como estudiante</w:t>
+      </w:r>
+    </w:p>
+    <w:p>
+      <w:pPr>
+        <w:rPr>
+          <w:b/>
+          <w:bCs/>
+        </w:rPr>
+      </w:pPr>
+      <w:r>
+        <w:rPr>
+          <w:b/>
+          <w:bCs/>
+        </w:rPr>
+        <w:t>Quiero resolver talleres sin límite de tiempo</w:t>
+      </w:r>
+    </w:p>
+    <w:p>
+      <w:pPr>
+        <w:rPr>
+          <w:b/>
+          <w:bCs/>
+        </w:rPr>
+      </w:pPr>
+      <w:r>
+        <w:rPr>
+          <w:b/>
+          <w:bCs/>
+        </w:rPr>
+        <w:t>Para enfocarme en el aprendizaje.</w:t>
+      </w:r>
+    </w:p>
+    <w:p>
+      <w:pPr>
+        <w:rPr>
+          <w:b/>
+          <w:bCs/>
+        </w:rPr>
+      </w:pPr>
+      <w:r>
+        <w:rPr>
+          <w:b/>
+          <w:bCs/>
+        </w:rPr>
+        <w:pict w14:anchorId="67DD65D4">
+          <v:rect id="_x0000_i1036" style="width:0;height:1.5pt" o:hralign="center" o:hrstd="t" o:hr="t" fillcolor="#a0a0a0" stroked="f"/>
+        </w:pict>
+      </w:r>
+    </w:p>
+    <w:p>
+      <w:pPr>
+        <w:rPr>
+          <w:b/>
+          <w:bCs/>
+        </w:rPr>
+      </w:pPr>
+      <w:r>
+        <w:rPr>
+          <w:b/>
+          <w:bCs/>
+        </w:rPr>
+        <w:t>HU-016</w:t>
+      </w:r>
+    </w:p>
+    <w:p>
+      <w:pPr>
+        <w:rPr>
+          <w:b/>
+          <w:bCs/>
+        </w:rPr>
+      </w:pPr>
+      <w:r>
+        <w:rPr>
+          <w:b/>
+          <w:bCs/>
+        </w:rPr>
+        <w:t>Como estudiante</w:t>
+      </w:r>
+    </w:p>
+    <w:p>
+      <w:pPr>
+        <w:rPr>
+          <w:b/>
+          <w:bCs/>
+        </w:rPr>
+      </w:pPr>
+      <w:r>
+        <w:rPr>
+          <w:b/>
+          <w:bCs/>
+        </w:rPr>
+        <w:t>Quiero ver cuáles respuestas fueron correctas e incorrectas</w:t>
+      </w:r>
+    </w:p>
+    <w:p>
+      <w:pPr>
+        <w:rPr>
+          <w:b/>
+          <w:bCs/>
+        </w:rPr>
+      </w:pPr>
+      <w:r>
+        <w:rPr>
+          <w:b/>
+          <w:bCs/>
+        </w:rPr>
+        <w:t>Para identificar mis errores.</w:t>
+      </w:r>
+    </w:p>
+    <w:p>
+      <w:pPr>
+        <w:rPr>
+          <w:b/>
+          <w:bCs/>
+        </w:rPr>
+      </w:pPr>
+    </w:p>
+    <w:p>
+      <w:pPr>
+        <w:rPr>
+          <w:b/>
+          <w:bCs/>
+        </w:rPr>
+      </w:pPr>
+      <w:r>
+        <w:rPr>
+          <w:b/>
+          <w:bCs/>
+        </w:rPr>
+        <w:t>MÓDULO 5: RESULTADOS</w:t>
+      </w:r>
+    </w:p>
+    <w:p>
+      <w:pPr>
+        <w:rPr>
+          <w:b/>
+          <w:bCs/>
+        </w:rPr>
+      </w:pPr>
+    </w:p>
+    <w:p>
+      <w:r>
+        <w:t>HU-017</w:t>
+      </w:r>
+    </w:p>
+    <w:p>
+      <w:r>
+        <w:t>Como estudiante</w:t>
+      </w:r>
+    </w:p>
+    <w:p>
+      <w:r>
+        <w:t>Quiero visualizar mi puntaje global</w:t>
+      </w:r>
+    </w:p>
+    <w:p>
+      <w:r>
+        <w:t>Para estimar mi rendimiento general.</w:t>
+      </w:r>
+    </w:p>
+    <w:p>
+      <w:r>
+        <w:pict w14:anchorId="325ACC8C">
           <v:rect id="_x0000_i1037" style="width:0;height:1.5pt" o:hralign="center" o:hrstd="t" o:hr="t" fillcolor="#a0a0a0" stroked="f"/>
         </w:pict>
       </w:r>
     </w:p>
     <w:p>
-      <w:pPr>
-        <w:rPr>
-          <w:b/>
-          <w:bCs/>
-        </w:rPr>
-      </w:pPr>
-      <w:r>
-        <w:rPr>
-          <w:b/>
-          <w:bCs/>
-        </w:rPr>
-        <w:t>HU-002</w:t>
-      </w:r>
-    </w:p>
-    <w:p>
-      <w:r>
-        <w:rPr>
-          <w:b/>
-          <w:bCs/>
-        </w:rPr>
+      <w:r>
+        <w:t>HU-018</w:t>
+      </w:r>
+    </w:p>
+    <w:p>
+      <w:r>
         <w:t>Como estudiante</w:t>
       </w:r>
     </w:p>
     <w:p>
       <w:r>
-        <w:t>Quiero cerrar sesión</w:t>
-      </w:r>
-    </w:p>
-    <w:p>
-      <w:r>
-        <w:rPr>
-          <w:b/>
-          <w:bCs/>
-        </w:rPr>
-        <w:t>Para</w:t>
-      </w:r>
-      <w:r>
-        <w:t xml:space="preserve"> proteger mi información.</w:t>
-      </w:r>
-    </w:p>
-    <w:p>
-      <w:r>
-        <w:pict w14:anchorId="439E0D14">
+        <w:t>Quiero visualizar mis puntajes por área</w:t>
+      </w:r>
+    </w:p>
+    <w:p>
+      <w:r>
+        <w:t>Para identificar fortalezas y debilidades.</w:t>
+      </w:r>
+    </w:p>
+    <w:p>
+      <w:r>
+        <w:pict w14:anchorId="6065F32B">
           <v:rect id="_x0000_i1038" style="width:0;height:1.5pt" o:hralign="center" o:hrstd="t" o:hr="t" fillcolor="#a0a0a0" stroked="f"/>
         </w:pict>
       </w:r>
     </w:p>
     <w:p>
-      <w:pPr>
-        <w:rPr>
-          <w:b/>
-          <w:bCs/>
-        </w:rPr>
-      </w:pPr>
-      <w:r>
-        <w:rPr>
-          <w:b/>
-          <w:bCs/>
-        </w:rPr>
-        <w:t>HU-003</w:t>
-      </w:r>
-    </w:p>
-    <w:p>
-      <w:r>
-        <w:rPr>
-          <w:b/>
-          <w:bCs/>
-        </w:rPr>
-        <w:t>Como estudiante</w:t>
-      </w:r>
-    </w:p>
-    <w:p>
-      <w:r>
-        <w:t>Quiero recuperar mi contraseña</w:t>
-      </w:r>
-    </w:p>
-    <w:p>
-      <w:r>
-        <w:t>Para</w:t>
-      </w:r>
-      <w:r>
-        <w:t xml:space="preserve"> volver a acceder a mi cuenta si la olvido.</w:t>
-      </w:r>
-    </w:p>
-    <w:p>
-      <w:pPr>
-        <w:rPr>
-          <w:b/>
-          <w:bCs/>
-        </w:rPr>
-      </w:pPr>
-    </w:p>
-    <w:p>
-      <w:pPr>
-        <w:rPr>
-          <w:b/>
-          <w:bCs/>
-        </w:rPr>
-      </w:pPr>
-      <w:r>
-        <w:rPr>
-          <w:b/>
-          <w:bCs/>
-        </w:rPr>
-        <w:t>MÓDULO 2: DASHBOARD</w:t>
-      </w:r>
-    </w:p>
-    <w:p>
-      <w:pPr>
-        <w:rPr>
-          <w:b/>
-          <w:bCs/>
-        </w:rPr>
-      </w:pPr>
-    </w:p>
-    <w:p>
-      <w:pPr>
-        <w:rPr>
-          <w:b/>
-          <w:bCs/>
-        </w:rPr>
-      </w:pPr>
-      <w:r>
-        <w:rPr>
-          <w:b/>
-          <w:bCs/>
-        </w:rPr>
-        <w:t>HU-004</w:t>
-      </w:r>
-    </w:p>
-    <w:p>
-      <w:r>
-        <w:rPr>
-          <w:b/>
-          <w:bCs/>
-        </w:rPr>
-        <w:t>Como estudiante</w:t>
-      </w:r>
-    </w:p>
-    <w:p>
-      <w:r>
-        <w:t>Quiero visualizar mi último puntaje obtenido</w:t>
-      </w:r>
-    </w:p>
-    <w:p>
-      <w:r>
-        <w:rPr>
-          <w:b/>
-          <w:bCs/>
-        </w:rPr>
-        <w:t>Para</w:t>
-      </w:r>
-      <w:r>
-        <w:t xml:space="preserve"> conocer mi desempeño más reciente.</w:t>
-      </w:r>
-    </w:p>
-    <w:p>
-      <w:r>
-        <w:pict w14:anchorId="05FC8026">
-          <v:rect id="_x0000_i1059" style="width:0;height:1.5pt" o:hralign="center" o:hrstd="t" o:hr="t" fillcolor="#a0a0a0" stroked="f"/>
-        </w:pict>
-      </w:r>
-    </w:p>
-    <w:p>
-      <w:pPr>
-        <w:rPr>
-          <w:b/>
-          <w:bCs/>
-        </w:rPr>
-      </w:pPr>
-      <w:r>
-        <w:rPr>
-          <w:b/>
-          <w:bCs/>
-        </w:rPr>
-        <w:t>HU-005</w:t>
-      </w:r>
-    </w:p>
-    <w:p>
-      <w:r>
-        <w:rPr>
-          <w:b/>
-          <w:bCs/>
-        </w:rPr>
-        <w:lastRenderedPageBreak/>
-        <w:t>Como estudiante</w:t>
-      </w:r>
-    </w:p>
-    <w:p>
-      <w:r>
-        <w:t>Quiero visualizar mi mejor puntaje histórico</w:t>
-      </w:r>
-    </w:p>
-    <w:p>
-      <w:r>
-        <w:rPr>
-          <w:b/>
-          <w:bCs/>
-        </w:rPr>
-        <w:t>Para</w:t>
-      </w:r>
-      <w:r>
-        <w:t xml:space="preserve"> medir mi progreso.</w:t>
-      </w:r>
-    </w:p>
-    <w:p>
-      <w:r>
-        <w:pict w14:anchorId="42CCF6F7">
-          <v:rect id="_x0000_i1060" style="width:0;height:1.5pt" o:hralign="center" o:hrstd="t" o:hr="t" fillcolor="#a0a0a0" stroked="f"/>
-        </w:pict>
-      </w:r>
-    </w:p>
-    <w:p>
-      <w:pPr>
-        <w:rPr>
-          <w:b/>
-          <w:bCs/>
-        </w:rPr>
-      </w:pPr>
-      <w:r>
-        <w:rPr>
-          <w:b/>
-          <w:bCs/>
-        </w:rPr>
-        <w:t>HU-006</w:t>
-      </w:r>
-    </w:p>
-    <w:p>
-      <w:r>
-        <w:rPr>
-          <w:b/>
-          <w:bCs/>
-        </w:rPr>
-        <w:t>Como estudiante</w:t>
-      </w:r>
-    </w:p>
-    <w:p>
-      <w:r>
-        <w:t>Quiero conocer cuántos simulacros he realizado</w:t>
-      </w:r>
-    </w:p>
-    <w:p>
-      <w:r>
-        <w:rPr>
-          <w:b/>
-          <w:bCs/>
-        </w:rPr>
-        <w:t>Para</w:t>
-      </w:r>
-      <w:r>
-        <w:t xml:space="preserve"> hacer seguimiento a mi preparación.</w:t>
-      </w:r>
-    </w:p>
-    <w:p>
-      <w:r>
-        <w:pict w14:anchorId="4C2B2E4F">
-          <v:rect id="_x0000_i1061" style="width:0;height:1.5pt" o:hralign="center" o:hrstd="t" o:hr="t" fillcolor="#a0a0a0" stroked="f"/>
-        </w:pict>
-      </w:r>
-    </w:p>
-    <w:p>
-      <w:pPr>
-        <w:rPr>
-          <w:b/>
-          <w:bCs/>
-        </w:rPr>
-      </w:pPr>
-      <w:r>
-        <w:rPr>
-          <w:b/>
-          <w:bCs/>
-        </w:rPr>
-        <w:t>HU-007</w:t>
-      </w:r>
-    </w:p>
-    <w:p>
-      <w:r>
-        <w:rPr>
-          <w:b/>
-          <w:bCs/>
-        </w:rPr>
-        <w:t>Como estudiante</w:t>
-      </w:r>
-    </w:p>
-    <w:p>
-      <w:r>
-        <w:t>Quiero acceder rápidamente a simulacros, talleres y estadísticas</w:t>
-      </w:r>
-    </w:p>
-    <w:p>
-      <w:r>
-        <w:rPr>
-          <w:b/>
-          <w:bCs/>
-        </w:rPr>
-        <w:t>Para</w:t>
-      </w:r>
-      <w:r>
-        <w:t xml:space="preserve"> navegar fácilmente por la plataforma.</w:t>
-      </w:r>
-    </w:p>
-    <w:p>
-      <w:pPr>
-        <w:rPr>
-          <w:b/>
-          <w:bCs/>
-        </w:rPr>
-      </w:pPr>
-    </w:p>
-    <w:p>
-      <w:pPr>
-        <w:rPr>
-          <w:b/>
-          <w:bCs/>
-        </w:rPr>
-      </w:pPr>
-      <w:r>
-        <w:rPr>
-          <w:b/>
-          <w:bCs/>
-        </w:rPr>
-        <w:t>MÓDULO 3: SIMULACROS</w:t>
-      </w:r>
-    </w:p>
-    <w:p/>
-    <w:p>
-      <w:pPr>
-        <w:rPr>
-          <w:b/>
-          <w:bCs/>
-        </w:rPr>
-      </w:pPr>
-      <w:r>
-        <w:rPr>
-          <w:b/>
-          <w:bCs/>
-        </w:rPr>
-        <w:t>HU-008</w:t>
-      </w:r>
-    </w:p>
-    <w:p>
-      <w:r>
-        <w:rPr>
-          <w:b/>
-          <w:bCs/>
-        </w:rPr>
-        <w:t>Como estudiante</w:t>
-      </w:r>
-    </w:p>
-    <w:p>
-      <w:r>
-        <w:t>Quiero generar un simulacro completo</w:t>
-      </w:r>
-    </w:p>
-    <w:p>
-      <w:r>
-        <w:rPr>
-          <w:b/>
-          <w:bCs/>
-        </w:rPr>
-        <w:t>Para</w:t>
-      </w:r>
-      <w:r>
-        <w:t xml:space="preserve"> practicar en condiciones similares al ICFES.</w:t>
-      </w:r>
-    </w:p>
-    <w:p>
-      <w:r>
-        <w:pict w14:anchorId="7CE4887C">
-          <v:rect id="_x0000_i1095" style="width:0;height:1.5pt" o:hralign="center" o:hrstd="t" o:hr="t" fillcolor="#a0a0a0" stroked="f"/>
-        </w:pict>
-      </w:r>
-    </w:p>
-    <w:p>
-      <w:pPr>
-        <w:rPr>
-          <w:b/>
-          <w:bCs/>
-        </w:rPr>
-      </w:pPr>
-      <w:r>
-        <w:rPr>
-          <w:b/>
-          <w:bCs/>
-        </w:rPr>
-        <w:t>HU-009</w:t>
-      </w:r>
-    </w:p>
-    <w:p>
-      <w:r>
-        <w:rPr>
-          <w:b/>
-          <w:bCs/>
-        </w:rPr>
-        <w:t>Como estudiante</w:t>
-      </w:r>
-    </w:p>
-    <w:p>
-      <w:r>
-        <w:t>Quiero generar un simulacro por área</w:t>
-      </w:r>
-    </w:p>
-    <w:p>
-      <w:r>
-        <w:rPr>
-          <w:b/>
-          <w:bCs/>
-        </w:rPr>
-        <w:t>Para</w:t>
-      </w:r>
-      <w:r>
-        <w:t xml:space="preserve"> reforzar una materia específica.</w:t>
-      </w:r>
-    </w:p>
-    <w:p>
-      <w:r>
-        <w:pict w14:anchorId="6654FDD9">
-          <v:rect id="_x0000_i1096" style="width:0;height:1.5pt" o:hralign="center" o:hrstd="t" o:hr="t" fillcolor="#a0a0a0" stroked="f"/>
-        </w:pict>
-      </w:r>
-    </w:p>
-    <w:p>
-      <w:pPr>
-        <w:rPr>
-          <w:b/>
-          <w:bCs/>
-        </w:rPr>
-      </w:pPr>
-      <w:r>
-        <w:rPr>
-          <w:b/>
-          <w:bCs/>
-        </w:rPr>
-        <w:lastRenderedPageBreak/>
-        <w:t>HU-010</w:t>
-      </w:r>
-    </w:p>
-    <w:p>
-      <w:r>
-        <w:rPr>
-          <w:b/>
-          <w:bCs/>
-        </w:rPr>
-        <w:t>Como estudiante</w:t>
-      </w:r>
-    </w:p>
-    <w:p>
-      <w:r>
-        <w:t>Quiero elegir si realizar un simulacro cronometrado o libre</w:t>
-      </w:r>
-    </w:p>
-    <w:p>
-      <w:r>
-        <w:rPr>
-          <w:b/>
-          <w:bCs/>
-        </w:rPr>
-        <w:t>Para</w:t>
-      </w:r>
-      <w:r>
-        <w:t xml:space="preserve"> adaptar la práctica a mis necesidades.</w:t>
-      </w:r>
-    </w:p>
-    <w:p>
-      <w:r>
-        <w:pict w14:anchorId="659B50F6">
-          <v:rect id="_x0000_i1097" style="width:0;height:1.5pt" o:hralign="center" o:hrstd="t" o:hr="t" fillcolor="#a0a0a0" stroked="f"/>
-        </w:pict>
-      </w:r>
-    </w:p>
-    <w:p>
-      <w:pPr>
-        <w:rPr>
-          <w:b/>
-          <w:bCs/>
-        </w:rPr>
-      </w:pPr>
-      <w:r>
-        <w:rPr>
-          <w:b/>
-          <w:bCs/>
-        </w:rPr>
-        <w:t>HU-011</w:t>
-      </w:r>
-    </w:p>
-    <w:p>
-      <w:r>
-        <w:rPr>
-          <w:b/>
-          <w:bCs/>
-        </w:rPr>
-        <w:t>Como estudiante</w:t>
-      </w:r>
-    </w:p>
-    <w:p>
-      <w:r>
-        <w:t>Quiero responder preguntas con texto, imágenes y contextos</w:t>
-      </w:r>
-    </w:p>
-    <w:p>
-      <w:r>
-        <w:rPr>
-          <w:b/>
-          <w:bCs/>
-        </w:rPr>
-        <w:t>Para</w:t>
-      </w:r>
-      <w:r>
-        <w:t xml:space="preserve"> resolver ejercicios similares a los del ICFES.</w:t>
-      </w:r>
-    </w:p>
-    <w:p>
-      <w:r>
-        <w:pict w14:anchorId="127DD31F">
-          <v:rect id="_x0000_i1098" style="width:0;height:1.5pt" o:hralign="center" o:hrstd="t" o:hr="t" fillcolor="#a0a0a0" stroked="f"/>
-        </w:pict>
-      </w:r>
-    </w:p>
-    <w:p>
-      <w:pPr>
-        <w:rPr>
-          <w:b/>
-          <w:bCs/>
-        </w:rPr>
-      </w:pPr>
-      <w:r>
-        <w:rPr>
-          <w:b/>
-          <w:bCs/>
-        </w:rPr>
-        <w:t>HU-012</w:t>
-      </w:r>
-    </w:p>
-    <w:p>
-      <w:r>
-        <w:rPr>
-          <w:b/>
-          <w:bCs/>
-        </w:rPr>
-        <w:t>Como estudiante</w:t>
-      </w:r>
-    </w:p>
-    <w:p>
-      <w:r>
-        <w:t>Quiero guardar automáticamente mi progreso</w:t>
-      </w:r>
-    </w:p>
-    <w:p>
-      <w:r>
-        <w:rPr>
-          <w:b/>
-          <w:bCs/>
-        </w:rPr>
-        <w:t>Para</w:t>
-      </w:r>
-      <w:r>
-        <w:t xml:space="preserve"> continuar posteriormente si debo salir.</w:t>
-      </w:r>
-    </w:p>
-    <w:p>
-      <w:r>
-        <w:pict w14:anchorId="0019195E">
-          <v:rect id="_x0000_i1099" style="width:0;height:1.5pt" o:hralign="center" o:hrstd="t" o:hr="t" fillcolor="#a0a0a0" stroked="f"/>
-        </w:pict>
-      </w:r>
-    </w:p>
-    <w:p>
-      <w:pPr>
-        <w:rPr>
-          <w:b/>
-          <w:bCs/>
-        </w:rPr>
-      </w:pPr>
-      <w:r>
-        <w:rPr>
-          <w:b/>
-          <w:bCs/>
-        </w:rPr>
-        <w:t>HU-013</w:t>
-      </w:r>
-    </w:p>
-    <w:p>
-      <w:r>
-        <w:rPr>
-          <w:b/>
-          <w:bCs/>
-        </w:rPr>
-        <w:t>Como estudiante</w:t>
-      </w:r>
-    </w:p>
-    <w:p>
-      <w:r>
-        <w:t>Quiero finalizar un simulacro</w:t>
-      </w:r>
-    </w:p>
-    <w:p>
-      <w:r>
-        <w:rPr>
-          <w:b/>
-          <w:bCs/>
-        </w:rPr>
-        <w:t>Para</w:t>
-      </w:r>
-      <w:r>
-        <w:t xml:space="preserve"> obtener mis resultados.</w:t>
-      </w:r>
-    </w:p>
-    <w:p/>
-    <w:p>
-      <w:pPr>
-        <w:rPr>
-          <w:b/>
-          <w:bCs/>
-        </w:rPr>
-      </w:pPr>
-      <w:r>
-        <w:rPr>
-          <w:b/>
-          <w:bCs/>
-        </w:rPr>
-        <w:t>MÓDULO 4: TALLERES</w:t>
-      </w:r>
-    </w:p>
-    <w:p>
-      <w:pPr>
-        <w:rPr>
-          <w:b/>
-          <w:bCs/>
-        </w:rPr>
-      </w:pPr>
-    </w:p>
-    <w:p>
-      <w:pPr>
-        <w:rPr>
-          <w:b/>
-          <w:bCs/>
-        </w:rPr>
-      </w:pPr>
-      <w:r>
-        <w:rPr>
-          <w:b/>
-          <w:bCs/>
-        </w:rPr>
-        <w:t>HU-014</w:t>
-      </w:r>
-    </w:p>
-    <w:p>
-      <w:pPr>
-        <w:rPr>
-          <w:b/>
-          <w:bCs/>
-        </w:rPr>
-      </w:pPr>
-      <w:r>
-        <w:rPr>
-          <w:b/>
-          <w:bCs/>
-        </w:rPr>
-        <w:t>Como estudiante</w:t>
-      </w:r>
-    </w:p>
-    <w:p>
-      <w:pPr>
-        <w:rPr>
-          <w:b/>
-          <w:bCs/>
-        </w:rPr>
-      </w:pPr>
-      <w:r>
-        <w:rPr>
-          <w:b/>
-          <w:bCs/>
-        </w:rPr>
-        <w:t>Quiero acceder a talleres por área</w:t>
-      </w:r>
-    </w:p>
-    <w:p>
-      <w:pPr>
-        <w:rPr>
-          <w:b/>
-          <w:bCs/>
-        </w:rPr>
-      </w:pPr>
-      <w:r>
-        <w:rPr>
-          <w:b/>
-          <w:bCs/>
-        </w:rPr>
-        <w:t>Para practicar temas específicos.</w:t>
-      </w:r>
-    </w:p>
-    <w:p>
-      <w:pPr>
-        <w:rPr>
-          <w:b/>
-          <w:bCs/>
-        </w:rPr>
-      </w:pPr>
-      <w:r>
-        <w:rPr>
-          <w:b/>
-          <w:bCs/>
-        </w:rPr>
-        <w:lastRenderedPageBreak/>
-        <w:pict w14:anchorId="724F50D8">
-          <v:rect id="_x0000_i1117" style="width:0;height:1.5pt" o:hralign="center" o:hrstd="t" o:hr="t" fillcolor="#a0a0a0" stroked="f"/>
-        </w:pict>
-      </w:r>
-    </w:p>
-    <w:p>
-      <w:pPr>
-        <w:rPr>
-          <w:b/>
-          <w:bCs/>
-        </w:rPr>
-      </w:pPr>
-      <w:r>
-        <w:rPr>
-          <w:b/>
-          <w:bCs/>
-        </w:rPr>
-        <w:t>HU-015</w:t>
-      </w:r>
-    </w:p>
-    <w:p>
-      <w:pPr>
-        <w:rPr>
-          <w:b/>
-          <w:bCs/>
-        </w:rPr>
-      </w:pPr>
-      <w:r>
-        <w:rPr>
-          <w:b/>
-          <w:bCs/>
-        </w:rPr>
-        <w:t>Como estudiante</w:t>
-      </w:r>
-    </w:p>
-    <w:p>
-      <w:pPr>
-        <w:rPr>
-          <w:b/>
-          <w:bCs/>
-        </w:rPr>
-      </w:pPr>
-      <w:r>
-        <w:rPr>
-          <w:b/>
-          <w:bCs/>
-        </w:rPr>
-        <w:t>Quiero resolver talleres sin límite de tiempo</w:t>
-      </w:r>
-    </w:p>
-    <w:p>
-      <w:pPr>
-        <w:rPr>
-          <w:b/>
-          <w:bCs/>
-        </w:rPr>
-      </w:pPr>
-      <w:r>
-        <w:rPr>
-          <w:b/>
-          <w:bCs/>
-        </w:rPr>
-        <w:t>Para enfocarme en el aprendizaje.</w:t>
-      </w:r>
-    </w:p>
-    <w:p>
-      <w:pPr>
-        <w:rPr>
-          <w:b/>
-          <w:bCs/>
-        </w:rPr>
-      </w:pPr>
-      <w:r>
-        <w:rPr>
-          <w:b/>
-          <w:bCs/>
-        </w:rPr>
-        <w:pict w14:anchorId="67DD65D4">
-          <v:rect id="_x0000_i1118" style="width:0;height:1.5pt" o:hralign="center" o:hrstd="t" o:hr="t" fillcolor="#a0a0a0" stroked="f"/>
-        </w:pict>
-      </w:r>
-    </w:p>
-    <w:p>
-      <w:pPr>
-        <w:rPr>
-          <w:b/>
-          <w:bCs/>
-        </w:rPr>
-      </w:pPr>
-      <w:r>
-        <w:rPr>
-          <w:b/>
-          <w:bCs/>
-        </w:rPr>
-        <w:t>HU-016</w:t>
-      </w:r>
-    </w:p>
-    <w:p>
-      <w:pPr>
-        <w:rPr>
-          <w:b/>
-          <w:bCs/>
-        </w:rPr>
-      </w:pPr>
-      <w:r>
-        <w:rPr>
-          <w:b/>
-          <w:bCs/>
-        </w:rPr>
-        <w:t>Como estudiante</w:t>
-      </w:r>
-    </w:p>
-    <w:p>
-      <w:pPr>
-        <w:rPr>
-          <w:b/>
-          <w:bCs/>
-        </w:rPr>
-      </w:pPr>
-      <w:r>
-        <w:rPr>
-          <w:b/>
-          <w:bCs/>
-        </w:rPr>
-        <w:t>Quiero ver cuáles respuestas fueron correctas e incorrectas</w:t>
-      </w:r>
-    </w:p>
-    <w:p>
-      <w:pPr>
-        <w:rPr>
-          <w:b/>
-          <w:bCs/>
-        </w:rPr>
-      </w:pPr>
-      <w:r>
-        <w:rPr>
-          <w:b/>
-          <w:bCs/>
-        </w:rPr>
-        <w:t>Para identificar mis errores.</w:t>
-      </w:r>
-    </w:p>
-    <w:p>
-      <w:pPr>
-        <w:rPr>
-          <w:b/>
-          <w:bCs/>
-        </w:rPr>
-      </w:pPr>
-    </w:p>
-    <w:p>
-      <w:pPr>
-        <w:rPr>
-          <w:b/>
-          <w:bCs/>
-        </w:rPr>
-      </w:pPr>
-      <w:r>
-        <w:rPr>
-          <w:b/>
-          <w:bCs/>
-        </w:rPr>
-        <w:t>MÓDULO 5: RESULTADOS</w:t>
-      </w:r>
-    </w:p>
-    <w:p>
-      <w:pPr>
-        <w:rPr>
-          <w:b/>
-          <w:bCs/>
-        </w:rPr>
-      </w:pPr>
-    </w:p>
-    <w:p>
-      <w:r>
-        <w:t>HU-017</w:t>
-      </w:r>
-    </w:p>
-    <w:p>
-      <w:r>
-        <w:t>Como estudiante</w:t>
-      </w:r>
-    </w:p>
-    <w:p>
-      <w:r>
-        <w:t>Quiero visualizar mi puntaje global</w:t>
-      </w:r>
-    </w:p>
-    <w:p>
-      <w:r>
-        <w:t>Para estimar mi rendimiento general.</w:t>
-      </w:r>
-    </w:p>
-    <w:p>
-      <w:r>
-        <w:pict w14:anchorId="325ACC8C">
-          <v:rect id="_x0000_i1133" style="width:0;height:1.5pt" o:hralign="center" o:hrstd="t" o:hr="t" fillcolor="#a0a0a0" stroked="f"/>
-        </w:pict>
-      </w:r>
-    </w:p>
-    <w:p>
-      <w:r>
-        <w:t>HU-018</w:t>
-      </w:r>
-    </w:p>
-    <w:p>
-      <w:r>
-        <w:t>Como estudiante</w:t>
-      </w:r>
-    </w:p>
-    <w:p>
-      <w:r>
-        <w:t>Quiero visualizar mis puntajes por área</w:t>
-      </w:r>
-    </w:p>
-    <w:p>
-      <w:r>
-        <w:t>Para identificar fortalezas y debilidades.</w:t>
-      </w:r>
-    </w:p>
-    <w:p>
-      <w:r>
-        <w:pict w14:anchorId="6065F32B">
-          <v:rect id="_x0000_i1134" style="width:0;height:1.5pt" o:hralign="center" o:hrstd="t" o:hr="t" fillcolor="#a0a0a0" stroked="f"/>
-        </w:pict>
-      </w:r>
-    </w:p>
-    <w:p>
       <w:r>
         <w:t>HU-019</w:t>
       </w:r>
@@ -1091,7 +1091,7 @@
     <w:p>
       <w:r>
         <w:pict w14:anchorId="1CBA32DC">
-          <v:rect id="_x0000_i1161" style="width:0;height:1.5pt" o:hralign="center" o:hrstd="t" o:hr="t" fillcolor="#a0a0a0" stroked="f"/>
+          <v:rect id="_x0000_i1039" style="width:0;height:1.5pt" o:hralign="center" o:hrstd="t" o:hr="t" fillcolor="#a0a0a0" stroked="f"/>
         </w:pict>
       </w:r>
     </w:p>
@@ -1118,7 +1118,7 @@
     <w:p>
       <w:r>
         <w:pict w14:anchorId="2E3DF2D9">
-          <v:rect id="_x0000_i1162" style="width:0;height:1.5pt" o:hralign="center" o:hrstd="t" o:hr="t" fillcolor="#a0a0a0" stroked="f"/>
+          <v:rect id="_x0000_i1040" style="width:0;height:1.5pt" o:hralign="center" o:hrstd="t" o:hr="t" fillcolor="#a0a0a0" stroked="f"/>
         </w:pict>
       </w:r>
     </w:p>
@@ -1145,7 +1145,7 @@
     <w:p>
       <w:r>
         <w:pict w14:anchorId="199A28E7">
-          <v:rect id="_x0000_i1163" style="width:0;height:1.5pt" o:hralign="center" o:hrstd="t" o:hr="t" fillcolor="#a0a0a0" stroked="f"/>
+          <v:rect id="_x0000_i1041" style="width:0;height:1.5pt" o:hralign="center" o:hrstd="t" o:hr="t" fillcolor="#a0a0a0" stroked="f"/>
         </w:pict>
       </w:r>
     </w:p>
@@ -1172,7 +1172,7 @@
     <w:p>
       <w:r>
         <w:pict w14:anchorId="4A1FF6FD">
-          <v:rect id="_x0000_i1164" style="width:0;height:1.5pt" o:hralign="center" o:hrstd="t" o:hr="t" fillcolor="#a0a0a0" stroked="f"/>
+          <v:rect id="_x0000_i1042" style="width:0;height:1.5pt" o:hralign="center" o:hrstd="t" o:hr="t" fillcolor="#a0a0a0" stroked="f"/>
         </w:pict>
       </w:r>
     </w:p>
@@ -1270,7 +1270,7 @@
     <w:p>
       <w:r>
         <w:pict w14:anchorId="01C49455">
-          <v:rect id="_x0000_i1223" style="width:0;height:1.5pt" o:hralign="center" o:hrstd="t" o:hr="t" fillcolor="#a0a0a0" stroked="f"/>
+          <v:rect id="_x0000_i1043" style="width:0;height:1.5pt" o:hralign="center" o:hrstd="t" o:hr="t" fillcolor="#a0a0a0" stroked="f"/>
         </w:pict>
       </w:r>
     </w:p>
@@ -1318,7 +1318,7 @@
     <w:p>
       <w:r>
         <w:pict w14:anchorId="6D7B34A7">
-          <v:rect id="_x0000_i1224" style="width:0;height:1.5pt" o:hralign="center" o:hrstd="t" o:hr="t" fillcolor="#a0a0a0" stroked="f"/>
+          <v:rect id="_x0000_i1044" style="width:0;height:1.5pt" o:hralign="center" o:hrstd="t" o:hr="t" fillcolor="#a0a0a0" stroked="f"/>
         </w:pict>
       </w:r>
     </w:p>
@@ -1366,7 +1366,7 @@
     <w:p>
       <w:r>
         <w:pict w14:anchorId="2A9FD838">
-          <v:rect id="_x0000_i1225" style="width:0;height:1.5pt" o:hralign="center" o:hrstd="t" o:hr="t" fillcolor="#a0a0a0" stroked="f"/>
+          <v:rect id="_x0000_i1045" style="width:0;height:1.5pt" o:hralign="center" o:hrstd="t" o:hr="t" fillcolor="#a0a0a0" stroked="f"/>
         </w:pict>
       </w:r>
     </w:p>
@@ -1415,7 +1415,7 @@
       <w:r>
         <w:lastRenderedPageBreak/>
         <w:pict w14:anchorId="513695F6">
-          <v:rect id="_x0000_i1226" style="width:0;height:1.5pt" o:hralign="center" o:hrstd="t" o:hr="t" fillcolor="#a0a0a0" stroked="f"/>
+          <v:rect id="_x0000_i1046" style="width:0;height:1.5pt" o:hralign="center" o:hrstd="t" o:hr="t" fillcolor="#a0a0a0" stroked="f"/>
         </w:pict>
       </w:r>
     </w:p>
@@ -1463,7 +1463,7 @@
     <w:p>
       <w:r>
         <w:pict w14:anchorId="3623F25B">
-          <v:rect id="_x0000_i1227" style="width:0;height:1.5pt" o:hralign="center" o:hrstd="t" o:hr="t" fillcolor="#a0a0a0" stroked="f"/>
+          <v:rect id="_x0000_i1047" style="width:0;height:1.5pt" o:hralign="center" o:hrstd="t" o:hr="t" fillcolor="#a0a0a0" stroked="f"/>
         </w:pict>
       </w:r>
     </w:p>
@@ -1511,7 +1511,7 @@
     <w:p>
       <w:r>
         <w:pict w14:anchorId="1C156DCB">
-          <v:rect id="_x0000_i1228" style="width:0;height:1.5pt" o:hralign="center" o:hrstd="t" o:hr="t" fillcolor="#a0a0a0" stroked="f"/>
+          <v:rect id="_x0000_i1048" style="width:0;height:1.5pt" o:hralign="center" o:hrstd="t" o:hr="t" fillcolor="#a0a0a0" stroked="f"/>
         </w:pict>
       </w:r>
     </w:p>
@@ -1559,7 +1559,7 @@
     <w:p>
       <w:r>
         <w:pict w14:anchorId="7D21CB53">
-          <v:rect id="_x0000_i1229" style="width:0;height:1.5pt" o:hralign="center" o:hrstd="t" o:hr="t" fillcolor="#a0a0a0" stroked="f"/>
+          <v:rect id="_x0000_i1049" style="width:0;height:1.5pt" o:hralign="center" o:hrstd="t" o:hr="t" fillcolor="#a0a0a0" stroked="f"/>
         </w:pict>
       </w:r>
     </w:p>
@@ -1607,7 +1607,7 @@
     <w:p>
       <w:r>
         <w:pict w14:anchorId="14823367">
-          <v:rect id="_x0000_i1230" style="width:0;height:1.5pt" o:hralign="center" o:hrstd="t" o:hr="t" fillcolor="#a0a0a0" stroked="f"/>
+          <v:rect id="_x0000_i1050" style="width:0;height:1.5pt" o:hralign="center" o:hrstd="t" o:hr="t" fillcolor="#a0a0a0" stroked="f"/>
         </w:pict>
       </w:r>
     </w:p>
@@ -1650,6 +1650,444 @@
       </w:r>
       <w:r>
         <w:t xml:space="preserve"> evaluar el impacto de la plataforma.</w:t>
+      </w:r>
+    </w:p>
+    <w:p/>
+    <w:p/>
+    <w:p>
+      <w:pPr>
+        <w:jc w:val="center"/>
+        <w:rPr>
+          <w:b/>
+          <w:bCs/>
+        </w:rPr>
+      </w:pPr>
+      <w:r>
+        <w:rPr>
+          <w:b/>
+          <w:bCs/>
+        </w:rPr>
+        <w:t>ÉPICAS</w:t>
+      </w:r>
+    </w:p>
+    <w:p/>
+    <w:p>
+      <w:pPr>
+        <w:rPr>
+          <w:b/>
+          <w:bCs/>
+        </w:rPr>
+      </w:pPr>
+      <w:r>
+        <w:rPr>
+          <w:b/>
+          <w:bCs/>
+        </w:rPr>
+        <w:t>ÉPICA 1: Autenticación</w:t>
+      </w:r>
+    </w:p>
+    <w:p>
+      <w:r>
+        <w:t>Objetivo:</w:t>
+      </w:r>
+    </w:p>
+    <w:p>
+      <w:r>
+        <w:t>Permitir que estudiantes y administradores accedan de forma segura a la plataforma.</w:t>
+      </w:r>
+    </w:p>
+    <w:p>
+      <w:r>
+        <w:t>Historias:</w:t>
+      </w:r>
+    </w:p>
+    <w:p>
+      <w:r>
+        <w:t>HU-001</w:t>
+      </w:r>
+      <w:r>
+        <w:br/>
+        <w:t>HU-002</w:t>
+      </w:r>
+      <w:r>
+        <w:br/>
+        <w:t>HU-003</w:t>
+      </w:r>
+    </w:p>
+    <w:p>
+      <w:r>
+        <w:pict w14:anchorId="3C15F202">
+          <v:rect id="_x0000_i1087" style="width:0;height:1.5pt" o:hralign="center" o:hrstd="t" o:hr="t" fillcolor="#a0a0a0" stroked="f"/>
+        </w:pict>
+      </w:r>
+    </w:p>
+    <w:p>
+      <w:pPr>
+        <w:rPr>
+          <w:b/>
+          <w:bCs/>
+        </w:rPr>
+      </w:pPr>
+      <w:r>
+        <w:rPr>
+          <w:b/>
+          <w:bCs/>
+        </w:rPr>
+        <w:t xml:space="preserve">ÉPICA 2: </w:t>
+      </w:r>
+      <w:proofErr w:type="spellStart"/>
+      <w:r>
+        <w:rPr>
+          <w:b/>
+          <w:bCs/>
+        </w:rPr>
+        <w:t>Dashboard</w:t>
+      </w:r>
+      <w:proofErr w:type="spellEnd"/>
+    </w:p>
+    <w:p>
+      <w:r>
+        <w:t>Objetivo:</w:t>
+      </w:r>
+    </w:p>
+    <w:p>
+      <w:r>
+        <w:t>Mostrar información rápida del estudiante.</w:t>
+      </w:r>
+    </w:p>
+    <w:p>
+      <w:r>
+        <w:t>Historias:</w:t>
+      </w:r>
+    </w:p>
+    <w:p>
+      <w:r>
+        <w:t>HU-004</w:t>
+      </w:r>
+      <w:r>
+        <w:br/>
+        <w:t>HU-005</w:t>
+      </w:r>
+      <w:r>
+        <w:br/>
+        <w:t>HU-006</w:t>
+      </w:r>
+      <w:r>
+        <w:br/>
+        <w:t>HU-007</w:t>
+      </w:r>
+    </w:p>
+    <w:p>
+      <w:r>
+        <w:pict w14:anchorId="30F20541">
+          <v:rect id="_x0000_i1088" style="width:0;height:1.5pt" o:hralign="center" o:hrstd="t" o:hr="t" fillcolor="#a0a0a0" stroked="f"/>
+        </w:pict>
+      </w:r>
+    </w:p>
+    <w:p>
+      <w:pPr>
+        <w:rPr>
+          <w:b/>
+          <w:bCs/>
+        </w:rPr>
+      </w:pPr>
+      <w:r>
+        <w:rPr>
+          <w:b/>
+          <w:bCs/>
+        </w:rPr>
+        <w:t>ÉPICA 3: Simulacros</w:t>
+      </w:r>
+    </w:p>
+    <w:p>
+      <w:r>
+        <w:t>Objetivo:</w:t>
+      </w:r>
+    </w:p>
+    <w:p>
+      <w:r>
+        <w:t>Permitir la generación y resolución de simulacros tipo ICFES.</w:t>
+      </w:r>
+    </w:p>
+    <w:p>
+      <w:r>
+        <w:t>Historias:</w:t>
+      </w:r>
+    </w:p>
+    <w:p>
+      <w:r>
+        <w:t>HU-008</w:t>
+      </w:r>
+      <w:r>
+        <w:br/>
+        <w:t>HU-009</w:t>
+      </w:r>
+      <w:r>
+        <w:br/>
+        <w:t>HU-010</w:t>
+      </w:r>
+      <w:r>
+        <w:br/>
+        <w:t>HU-011</w:t>
+      </w:r>
+      <w:r>
+        <w:br/>
+      </w:r>
+      <w:r>
+        <w:lastRenderedPageBreak/>
+        <w:t>HU-012</w:t>
+      </w:r>
+      <w:r>
+        <w:br/>
+        <w:t>HU-013</w:t>
+      </w:r>
+    </w:p>
+    <w:p>
+      <w:r>
+        <w:pict w14:anchorId="4FC04FE0">
+          <v:rect id="_x0000_i1089" style="width:0;height:1.5pt" o:hralign="center" o:hrstd="t" o:hr="t" fillcolor="#a0a0a0" stroked="f"/>
+        </w:pict>
+      </w:r>
+    </w:p>
+    <w:p>
+      <w:pPr>
+        <w:rPr>
+          <w:b/>
+          <w:bCs/>
+        </w:rPr>
+      </w:pPr>
+      <w:r>
+        <w:rPr>
+          <w:b/>
+          <w:bCs/>
+        </w:rPr>
+        <w:t>ÉPICA 4: Talleres</w:t>
+      </w:r>
+    </w:p>
+    <w:p>
+      <w:r>
+        <w:t>Objetivo:</w:t>
+      </w:r>
+    </w:p>
+    <w:p>
+      <w:r>
+        <w:t>Permitir práctica específica por temas o áreas.</w:t>
+      </w:r>
+    </w:p>
+    <w:p>
+      <w:r>
+        <w:t>Historias:</w:t>
+      </w:r>
+    </w:p>
+    <w:p>
+      <w:r>
+        <w:t>HU-014</w:t>
+      </w:r>
+      <w:r>
+        <w:br/>
+        <w:t>HU-015</w:t>
+      </w:r>
+      <w:r>
+        <w:br/>
+        <w:t>HU-016</w:t>
+      </w:r>
+    </w:p>
+    <w:p>
+      <w:r>
+        <w:pict w14:anchorId="1FC5263C">
+          <v:rect id="_x0000_i1090" style="width:0;height:1.5pt" o:hralign="center" o:hrstd="t" o:hr="t" fillcolor="#a0a0a0" stroked="f"/>
+        </w:pict>
+      </w:r>
+    </w:p>
+    <w:p>
+      <w:pPr>
+        <w:rPr>
+          <w:b/>
+          <w:bCs/>
+        </w:rPr>
+      </w:pPr>
+      <w:r>
+        <w:rPr>
+          <w:b/>
+          <w:bCs/>
+        </w:rPr>
+        <w:t>ÉPICA 5: Resultados</w:t>
+      </w:r>
+    </w:p>
+    <w:p>
+      <w:r>
+        <w:t>Objetivo:</w:t>
+      </w:r>
+    </w:p>
+    <w:p>
+      <w:r>
+        <w:t>Mostrar el desempeño obtenido.</w:t>
+      </w:r>
+    </w:p>
+    <w:p>
+      <w:r>
+        <w:t>Historias:</w:t>
+      </w:r>
+    </w:p>
+    <w:p>
+      <w:r>
+        <w:t>HU-017</w:t>
+      </w:r>
+      <w:r>
+        <w:br/>
+        <w:t>HU-018</w:t>
+      </w:r>
+      <w:r>
+        <w:br/>
+        <w:t>HU-019</w:t>
+      </w:r>
+    </w:p>
+    <w:p>
+      <w:r>
+        <w:pict w14:anchorId="695887D0">
+          <v:rect id="_x0000_i1091" style="width:0;height:1.5pt" o:hralign="center" o:hrstd="t" o:hr="t" fillcolor="#a0a0a0" stroked="f"/>
+        </w:pict>
+      </w:r>
+    </w:p>
+    <w:p>
+      <w:pPr>
+        <w:rPr>
+          <w:b/>
+          <w:bCs/>
+        </w:rPr>
+      </w:pPr>
+      <w:r>
+        <w:rPr>
+          <w:b/>
+          <w:bCs/>
+        </w:rPr>
+        <w:t>ÉPICA 6: Estadísticas</w:t>
+      </w:r>
+    </w:p>
+    <w:p>
+      <w:r>
+        <w:t>Objetivo:</w:t>
+      </w:r>
+    </w:p>
+    <w:p>
+      <w:r>
+        <w:t>Permitir seguimiento académico.</w:t>
+      </w:r>
+    </w:p>
+    <w:p>
+      <w:r>
+        <w:t>Historias:</w:t>
+      </w:r>
+    </w:p>
+    <w:p>
+      <w:r>
+        <w:t>HU-020</w:t>
+      </w:r>
+      <w:r>
+        <w:br/>
+        <w:t>HU-021</w:t>
+      </w:r>
+      <w:r>
+        <w:br/>
+        <w:t>HU-022</w:t>
+      </w:r>
+      <w:r>
+        <w:br/>
+        <w:t>HU-023</w:t>
+      </w:r>
+      <w:r>
+        <w:br/>
+        <w:t>HU-024</w:t>
+      </w:r>
+    </w:p>
+    <w:p>
+      <w:r>
+        <w:pict w14:anchorId="045F235D">
+          <v:rect id="_x0000_i1092" style="width:0;height:1.5pt" o:hralign="center" o:hrstd="t" o:hr="t" fillcolor="#a0a0a0" stroked="f"/>
+        </w:pict>
+      </w:r>
+    </w:p>
+    <w:p>
+      <w:pPr>
+        <w:rPr>
+          <w:b/>
+          <w:bCs/>
+        </w:rPr>
+      </w:pPr>
+      <w:r>
+        <w:rPr>
+          <w:b/>
+          <w:bCs/>
+        </w:rPr>
+        <w:lastRenderedPageBreak/>
+        <w:t>ÉPICA 7: Administración</w:t>
+      </w:r>
+    </w:p>
+    <w:p>
+      <w:r>
+        <w:t>Objetivo:</w:t>
+      </w:r>
+    </w:p>
+    <w:p>
+      <w:r>
+        <w:t>Gestionar usuarios y contenido académico.</w:t>
+      </w:r>
+    </w:p>
+    <w:p>
+      <w:r>
+        <w:t>Historias:</w:t>
+      </w:r>
+    </w:p>
+    <w:p>
+      <w:r>
+        <w:t>HU-025</w:t>
+      </w:r>
+      <w:r>
+        <w:br/>
+        <w:t>HU</w:t>
+      </w:r>
+      <w:r>
+        <w:t>-26</w:t>
+      </w:r>
+    </w:p>
+    <w:p>
+      <w:r>
+        <w:t>HU</w:t>
+      </w:r>
+      <w:r>
+        <w:t>-027</w:t>
+      </w:r>
+    </w:p>
+    <w:p>
+      <w:r>
+        <w:t>HU-028</w:t>
+      </w:r>
+    </w:p>
+    <w:p>
+      <w:r>
+        <w:t>HU-029</w:t>
+      </w:r>
+    </w:p>
+    <w:p>
+      <w:r>
+        <w:t>HU-030</w:t>
+      </w:r>
+    </w:p>
+    <w:p>
+      <w:r>
+        <w:t>HU-031</w:t>
+      </w:r>
+    </w:p>
+    <w:p>
+      <w:r>
+        <w:t>HU-032</w:t>
+      </w:r>
+      <w:r>
+        <w:br/>
+        <w:t>HU-03</w:t>
+      </w:r>
+      <w:r>
+        <w:t>3</w:t>
       </w:r>
     </w:p>
     <w:sectPr>

</xml_diff>